<commit_message>
chore: complete Maia.* rename (Maia.Client, gitlink, docs, workspace)
- Frontend folder MaiaAIEngineClient -> Maia.Client (+ audit UI feature, content updates).
- Advance Maia.Services gitlink to the renamed-projects commit (1cfee1f).
- Docs re-pointed to new project/namespace names: CLAUDE.md + MD-Files/* (incl. Maia.Tests in the file map).
- Workspace MaiaAIEngine.code-workspace -> Maia.code-workspace; .gitignore;
  finish-rename.ps1 helper; docs/AuditUI.txt.

Co-Authored-By: Claude Opus 4.8 (1M context) <noreply@anthropic.com>
</commit_message>
<xml_diff>
--- a/docs/Maia Assistant for NSG.docx
+++ b/docs/Maia Assistant for NSG.docx
@@ -371,7 +371,36 @@
           <w:rtl/>
           <w:lang w:val="en-US"/>
         </w:rPr>
-        <w:t>התיקון : בתקיה זמנית -  הסרת בלוק יפוי כח שבו השדה ריק (זהוי לפי מס מסלקה)</w:t>
+        <w:t xml:space="preserve">התיקון : </w:t>
+      </w:r>
+      <w:r>
+        <w:rPr>
+          <w:lang w:val="en-US"/>
+        </w:rPr>
+        <w:br/>
+      </w:r>
+      <w:r>
+        <w:rPr>
+          <w:rFonts w:hint="cs"/>
+          <w:rtl/>
+          <w:lang w:val="en-US"/>
+        </w:rPr>
+        <w:t xml:space="preserve">בקובץ אירועים של 1700 </w:t>
+      </w:r>
+      <w:r>
+        <w:rPr>
+          <w:rtl/>
+          <w:lang w:val="en-US"/>
+        </w:rPr>
+        <w:br/>
+      </w:r>
+      <w:r>
+        <w:rPr>
+          <w:rFonts w:hint="cs"/>
+          <w:rtl/>
+          <w:lang w:val="en-US"/>
+        </w:rPr>
+        <w:t>בתקיה זמנית -  הסרת בלוק יפוי כח שבו השדה ריק (זהוי לפי מס מסלקה)</w:t>
       </w:r>
     </w:p>
     <w:p>
@@ -468,54 +497,6 @@
           <w:lang w:val="en-US"/>
         </w:rPr>
         <w:t xml:space="preserve">   חפ יצרן חפ מתפעל מיטב</w:t>
-      </w:r>
-    </w:p>
-    <w:p>
-      <w:pPr>
-        <w:bidi/>
-        <w:rPr>
-          <w:rFonts w:hint="cs"/>
-          <w:rtl/>
-          <w:lang w:val="en-US"/>
-        </w:rPr>
-      </w:pPr>
-      <w:r>
-        <w:rPr>
-          <w:rFonts w:hint="cs"/>
-          <w:rtl/>
-          <w:lang w:val="en-US"/>
-        </w:rPr>
-        <w:t xml:space="preserve">מעביר את הקובץ לתקיה זמנית </w:t>
-      </w:r>
-      <w:r>
-        <w:rPr>
-          <w:rtl/>
-          <w:lang w:val="en-US"/>
-        </w:rPr>
-        <w:t>–</w:t>
-      </w:r>
-      <w:r>
-        <w:rPr>
-          <w:rFonts w:hint="cs"/>
-          <w:rtl/>
-          <w:lang w:val="en-US"/>
-        </w:rPr>
-        <w:t xml:space="preserve"> עורך אותו </w:t>
-      </w:r>
-      <w:r>
-        <w:rPr>
-          <w:rtl/>
-          <w:lang w:val="en-US"/>
-        </w:rPr>
-        <w:t>–</w:t>
-      </w:r>
-      <w:r>
-        <w:rPr>
-          <w:rFonts w:hint="cs"/>
-          <w:rtl/>
-          <w:lang w:val="en-US"/>
-        </w:rPr>
-        <w:t xml:space="preserve"> מסיר את הבלוק יפוי כח</w:t>
       </w:r>
     </w:p>
     <w:p>
@@ -853,6 +834,7 @@
         <w:rPr>
           <w:lang w:val="en-US"/>
         </w:rPr>
+        <w:lastRenderedPageBreak/>
         <w:t>TransferRequestStage.StatusCode</w:t>
       </w:r>
       <w:proofErr w:type="spellEnd"/>
@@ -881,7 +863,6 @@
           <w:rtl/>
           <w:lang w:val="en-US"/>
         </w:rPr>
-        <w:lastRenderedPageBreak/>
         <w:t xml:space="preserve">מחיקת </w:t>
       </w:r>
       <w:r>
@@ -1175,7 +1156,6 @@
         <w:pStyle w:val="ListParagraph"/>
         <w:bidi/>
         <w:rPr>
-          <w:rFonts w:hint="cs"/>
           <w:rtl/>
           <w:lang w:val="en-US"/>
         </w:rPr>
@@ -1205,68 +1185,66 @@
       <w:pPr>
         <w:bidi/>
         <w:rPr>
-          <w:rFonts w:hint="cs"/>
-          <w:rtl/>
-          <w:lang w:val="en-US"/>
-        </w:rPr>
-      </w:pPr>
-    </w:p>
-    <w:p>
-      <w:pPr>
-        <w:bidi/>
-        <w:rPr>
-          <w:lang w:val="en-US"/>
-        </w:rPr>
-      </w:pPr>
-    </w:p>
-    <w:p>
-      <w:pPr>
-        <w:bidi/>
-        <w:rPr>
-          <w:lang w:val="en-US"/>
-        </w:rPr>
-      </w:pPr>
-    </w:p>
-    <w:p>
-      <w:pPr>
-        <w:bidi/>
-        <w:rPr>
-          <w:rtl/>
-          <w:lang w:val="en-US"/>
-        </w:rPr>
-      </w:pPr>
-    </w:p>
-    <w:p>
-      <w:pPr>
-        <w:bidi/>
-        <w:rPr>
-          <w:rtl/>
-          <w:lang w:val="en-US"/>
-        </w:rPr>
-      </w:pPr>
-    </w:p>
-    <w:p>
-      <w:pPr>
-        <w:bidi/>
-        <w:rPr>
-          <w:lang w:val="en-US"/>
-        </w:rPr>
-      </w:pPr>
-    </w:p>
-    <w:p>
-      <w:pPr>
-        <w:bidi/>
-        <w:rPr>
-          <w:rtl/>
-          <w:lang w:val="en-US"/>
-        </w:rPr>
-      </w:pPr>
-    </w:p>
-    <w:p>
-      <w:pPr>
-        <w:bidi/>
-        <w:rPr>
-          <w:rFonts w:hint="cs"/>
+          <w:rtl/>
+          <w:lang w:val="en-US"/>
+        </w:rPr>
+      </w:pPr>
+    </w:p>
+    <w:p>
+      <w:pPr>
+        <w:bidi/>
+        <w:rPr>
+          <w:lang w:val="en-US"/>
+        </w:rPr>
+      </w:pPr>
+    </w:p>
+    <w:p>
+      <w:pPr>
+        <w:bidi/>
+        <w:rPr>
+          <w:lang w:val="en-US"/>
+        </w:rPr>
+      </w:pPr>
+    </w:p>
+    <w:p>
+      <w:pPr>
+        <w:bidi/>
+        <w:rPr>
+          <w:rtl/>
+          <w:lang w:val="en-US"/>
+        </w:rPr>
+      </w:pPr>
+    </w:p>
+    <w:p>
+      <w:pPr>
+        <w:bidi/>
+        <w:rPr>
+          <w:rtl/>
+          <w:lang w:val="en-US"/>
+        </w:rPr>
+      </w:pPr>
+    </w:p>
+    <w:p>
+      <w:pPr>
+        <w:bidi/>
+        <w:rPr>
+          <w:lang w:val="en-US"/>
+        </w:rPr>
+      </w:pPr>
+    </w:p>
+    <w:p>
+      <w:pPr>
+        <w:bidi/>
+        <w:rPr>
+          <w:rtl/>
+          <w:lang w:val="en-US"/>
+        </w:rPr>
+      </w:pPr>
+    </w:p>
+    <w:p>
+      <w:pPr>
+        <w:bidi/>
+        <w:rPr>
           <w:rtl/>
           <w:lang w:val="en-US"/>
         </w:rPr>
@@ -2098,6 +2076,7 @@
   <w:style w:type="character" w:default="1" w:styleId="DefaultParagraphFont">
     <w:name w:val="Default Paragraph Font"/>
     <w:uiPriority w:val="1"/>
+    <w:semiHidden/>
     <w:unhideWhenUsed/>
   </w:style>
   <w:style w:type="table" w:default="1" w:styleId="TableNormal">

</xml_diff>